<commit_message>
doc: Applied last discussions on captures and samples management
</commit_message>
<xml_diff>
--- a/etat-des-lieux/Cross-DBio-etat-des-lieux_suivi-individus.docx
+++ b/etat-des-lieux/Cross-DBio-etat-des-lieux_suivi-individus.docx
@@ -3611,7 +3611,13 @@
         </w:drawing>
       </w:r>
       <w:r>
-        <w:t xml:space="preserve">Application mobile avec </w:t>
+        <w:t>Application</w:t>
+      </w:r>
+      <w:r>
+        <w:t>s</w:t>
+      </w:r>
+      <w:r>
+        <w:t xml:space="preserve"> mobile avec </w:t>
       </w:r>
       <w:r>
         <w:t>ODK Collect</w:t>
@@ -3716,7 +3722,13 @@
         <w:t xml:space="preserve"> de créer un nouvel individu marqué</w:t>
       </w:r>
       <w:r>
-        <w:t xml:space="preserve"> qui remontera ensuite dans la liste de bouquetins marqués d</w:t>
+        <w:t xml:space="preserve"> qui remontera ensuite dans la liste de</w:t>
+      </w:r>
+      <w:r>
+        <w:t>s</w:t>
+      </w:r>
+      <w:r>
+        <w:t xml:space="preserve"> bouquetins marqués d</w:t>
       </w:r>
       <w:r>
         <w:t>e l’application observation</w:t>
@@ -19509,7 +19521,7 @@
               </wp:inline>
             </w:drawing>
           </mc:Choice>
-          <mc:Fallback xmlns:arto="http://schemas.microsoft.com/office/word/2006/arto" xmlns:a16="http://schemas.microsoft.com/office/drawing/2014/main" xmlns:a14="http://schemas.microsoft.com/office/drawing/2010/main" xmlns:pic="http://schemas.openxmlformats.org/drawingml/2006/picture" xmlns:a="http://schemas.openxmlformats.org/drawingml/2006/main">
+          <mc:Fallback xmlns:a="http://schemas.openxmlformats.org/drawingml/2006/main" xmlns:pic="http://schemas.openxmlformats.org/drawingml/2006/picture" xmlns:a14="http://schemas.microsoft.com/office/drawing/2010/main" xmlns:a16="http://schemas.microsoft.com/office/drawing/2014/main" xmlns:arto="http://schemas.microsoft.com/office/word/2006/arto">
             <w:pict w14:anchorId="0F638488">
               <v:group id="Groupe 11" style="width:492pt;height:257.05pt;mso-position-horizontal-relative:char;mso-position-vertical-relative:line" coordsize="95101,55203" o:spid="_x0000_s1026" w14:anchorId="2C9DAE89" o:gfxdata="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">
                 <v:shapetype id="_x0000_t75" coordsize="21600,21600" filled="f" stroked="f" o:spt="75" o:preferrelative="t" path="m@4@5l@4@11@9@11@9@5xe">
@@ -30982,21 +30994,15 @@
 </file>
 
 <file path=customXml/item1.xml><?xml version="1.0" encoding="utf-8"?>
-<b:Sources xmlns:b="http://schemas.openxmlformats.org/officeDocument/2006/bibliography" xmlns="http://schemas.openxmlformats.org/officeDocument/2006/bibliography" SelectedStyle="\APASixthEditionOfficeOnline.xsl" StyleName="APA" Version="6"/>
+<?mso-contentType ?>
+<FormTemplates xmlns="http://schemas.microsoft.com/sharepoint/v3/contenttype/forms">
+  <Display>DocumentLibraryForm</Display>
+  <Edit>DocumentLibraryForm</Edit>
+  <New>DocumentLibraryForm</New>
+</FormTemplates>
 </file>
 
 <file path=customXml/item2.xml><?xml version="1.0" encoding="utf-8"?>
-<p:properties xmlns:p="http://schemas.microsoft.com/office/2006/metadata/properties" xmlns:xsi="http://www.w3.org/2001/XMLSchema-instance" xmlns:pc="http://schemas.microsoft.com/office/infopath/2007/PartnerControls">
-  <documentManagement>
-    <lcf76f155ced4ddcb4097134ff3c332f xmlns="e694866f-042b-408b-a5b8-45cbf0fd8817">
-      <Terms xmlns="http://schemas.microsoft.com/office/infopath/2007/PartnerControls"/>
-    </lcf76f155ced4ddcb4097134ff3c332f>
-    <TaxCatchAll xmlns="1ac8a35c-7706-4a28-9b71-7632be890fc6" xsi:nil="true"/>
-  </documentManagement>
-</p:properties>
-</file>
-
-<file path=customXml/item3.xml><?xml version="1.0" encoding="utf-8"?>
 <ct:contentTypeSchema xmlns:ct="http://schemas.microsoft.com/office/2006/metadata/contentType" xmlns:ma="http://schemas.microsoft.com/office/2006/metadata/properties/metaAttributes" ct:_="" ma:_="" ma:contentTypeName="Document" ma:contentTypeID="0x0101001F75719A250E29499DF45DA2347C1B5D" ma:contentTypeVersion="11" ma:contentTypeDescription="Crée un document." ma:contentTypeScope="" ma:versionID="44983fd106baf96996a4b6fe49d8ba03">
   <xsd:schema xmlns:xsd="http://www.w3.org/2001/XMLSchema" xmlns:xs="http://www.w3.org/2001/XMLSchema" xmlns:p="http://schemas.microsoft.com/office/2006/metadata/properties" xmlns:ns2="e694866f-042b-408b-a5b8-45cbf0fd8817" xmlns:ns3="1ac8a35c-7706-4a28-9b71-7632be890fc6" targetNamespace="http://schemas.microsoft.com/office/2006/metadata/properties" ma:root="true" ma:fieldsID="94cdfdee927ecc0625f72020dfbe4e07" ns2:_="" ns3:_="">
     <xsd:import namespace="e694866f-042b-408b-a5b8-45cbf0fd8817"/>
@@ -31191,24 +31197,49 @@
 </ct:contentTypeSchema>
 </file>
 
+<file path=customXml/item3.xml><?xml version="1.0" encoding="utf-8"?>
+<p:properties xmlns:p="http://schemas.microsoft.com/office/2006/metadata/properties" xmlns:xsi="http://www.w3.org/2001/XMLSchema-instance" xmlns:pc="http://schemas.microsoft.com/office/infopath/2007/PartnerControls">
+  <documentManagement>
+    <lcf76f155ced4ddcb4097134ff3c332f xmlns="e694866f-042b-408b-a5b8-45cbf0fd8817">
+      <Terms xmlns="http://schemas.microsoft.com/office/infopath/2007/PartnerControls"/>
+    </lcf76f155ced4ddcb4097134ff3c332f>
+    <TaxCatchAll xmlns="1ac8a35c-7706-4a28-9b71-7632be890fc6" xsi:nil="true"/>
+  </documentManagement>
+</p:properties>
+</file>
+
 <file path=customXml/item4.xml><?xml version="1.0" encoding="utf-8"?>
-<?mso-contentType ?>
-<FormTemplates xmlns="http://schemas.microsoft.com/sharepoint/v3/contenttype/forms">
-  <Display>DocumentLibraryForm</Display>
-  <Edit>DocumentLibraryForm</Edit>
-  <New>DocumentLibraryForm</New>
-</FormTemplates>
+<b:Sources xmlns:b="http://schemas.openxmlformats.org/officeDocument/2006/bibliography" xmlns="http://schemas.openxmlformats.org/officeDocument/2006/bibliography" SelectedStyle="\APASixthEditionOfficeOnline.xsl" StyleName="APA" Version="6"/>
 </file>
 
 <file path=customXml/itemProps1.xml><?xml version="1.0" encoding="utf-8"?>
-<ds:datastoreItem xmlns:ds="http://schemas.openxmlformats.org/officeDocument/2006/customXml" ds:itemID="{9F012E48-77F2-482C-B977-E674583FA8E3}">
+<ds:datastoreItem xmlns:ds="http://schemas.openxmlformats.org/officeDocument/2006/customXml" ds:itemID="{1066267E-716A-4A7B-869A-40492F2EE3FD}">
   <ds:schemaRefs>
-    <ds:schemaRef ds:uri="http://schemas.openxmlformats.org/officeDocument/2006/bibliography"/>
+    <ds:schemaRef ds:uri="http://schemas.microsoft.com/sharepoint/v3/contenttype/forms"/>
   </ds:schemaRefs>
 </ds:datastoreItem>
 </file>
 
 <file path=customXml/itemProps2.xml><?xml version="1.0" encoding="utf-8"?>
+<ds:datastoreItem xmlns:ds="http://schemas.openxmlformats.org/officeDocument/2006/customXml" ds:itemID="{BD8881CC-AD64-44E6-87DF-9E8AF946CB77}">
+  <ds:schemaRefs>
+    <ds:schemaRef ds:uri="http://schemas.microsoft.com/office/2006/metadata/contentType"/>
+    <ds:schemaRef ds:uri="http://schemas.microsoft.com/office/2006/metadata/properties/metaAttributes"/>
+    <ds:schemaRef ds:uri="http://www.w3.org/2001/XMLSchema"/>
+    <ds:schemaRef ds:uri="http://schemas.microsoft.com/office/2006/metadata/properties"/>
+    <ds:schemaRef ds:uri="e694866f-042b-408b-a5b8-45cbf0fd8817"/>
+    <ds:schemaRef ds:uri="1ac8a35c-7706-4a28-9b71-7632be890fc6"/>
+    <ds:schemaRef ds:uri="http://schemas.microsoft.com/office/2006/documentManagement/types"/>
+    <ds:schemaRef ds:uri="http://schemas.microsoft.com/office/infopath/2007/PartnerControls"/>
+    <ds:schemaRef ds:uri="http://schemas.openxmlformats.org/package/2006/metadata/core-properties"/>
+    <ds:schemaRef ds:uri="http://purl.org/dc/elements/1.1/"/>
+    <ds:schemaRef ds:uri="http://purl.org/dc/terms/"/>
+    <ds:schemaRef ds:uri="http://schemas.microsoft.com/internal/obd"/>
+  </ds:schemaRefs>
+</ds:datastoreItem>
+</file>
+
+<file path=customXml/itemProps3.xml><?xml version="1.0" encoding="utf-8"?>
 <ds:datastoreItem xmlns:ds="http://schemas.openxmlformats.org/officeDocument/2006/customXml" ds:itemID="{E4B86FE8-B2B8-43E7-B1E3-F712FB3EEE22}">
   <ds:schemaRefs>
     <ds:schemaRef ds:uri="http://schemas.microsoft.com/office/2006/metadata/properties"/>
@@ -31219,14 +31250,10 @@
 </ds:datastoreItem>
 </file>
 
-<file path=customXml/itemProps3.xml><?xml version="1.0" encoding="utf-8"?>
-<ds:datastoreItem xmlns:ds="http://schemas.openxmlformats.org/officeDocument/2006/customXml" ds:itemID="{BD8881CC-AD64-44E6-87DF-9E8AF946CB77}"/>
-</file>
-
 <file path=customXml/itemProps4.xml><?xml version="1.0" encoding="utf-8"?>
-<ds:datastoreItem xmlns:ds="http://schemas.openxmlformats.org/officeDocument/2006/customXml" ds:itemID="{1066267E-716A-4A7B-869A-40492F2EE3FD}">
+<ds:datastoreItem xmlns:ds="http://schemas.openxmlformats.org/officeDocument/2006/customXml" ds:itemID="{9F012E48-77F2-482C-B977-E674583FA8E3}">
   <ds:schemaRefs>
-    <ds:schemaRef ds:uri="http://schemas.microsoft.com/sharepoint/v3/contenttype/forms"/>
+    <ds:schemaRef ds:uri="http://schemas.openxmlformats.org/officeDocument/2006/bibliography"/>
   </ds:schemaRefs>
 </ds:datastoreItem>
 </file>
</xml_diff>